<commit_message>
actualizacion instrucciones y entregable
</commit_message>
<xml_diff>
--- a/README.docx
+++ b/README.docx
@@ -461,6 +461,12 @@
           <w:rFonts w:ascii="Courier New" w:hAnsi="Courier New" w:cs="Courier New"/>
         </w:rPr>
       </w:pPr>
+      <w:r>
+        <w:rPr>
+          <w:rFonts w:ascii="Courier New" w:hAnsi="Courier New" w:cs="Courier New"/>
+        </w:rPr>
+        <w:t>https://github.com/Guanfernando/software_votaciones.git</w:t>
+      </w:r>
     </w:p>
     <w:p>
       <w:pPr>
@@ -545,13 +551,7 @@
         <w:pStyle w:val="Textosinformato"/>
       </w:pPr>
       <w:r>
-        <w:t>DB_PASSWORD=</w:t>
-      </w:r>
-      <w:r>
-        <w:t>contraseña propia</w:t>
-      </w:r>
-      <w:r>
-        <w:t xml:space="preserve"> </w:t>
+        <w:t xml:space="preserve">DB_PASSWORD=contraseña propia </w:t>
       </w:r>
     </w:p>
     <w:p>
@@ -794,6 +794,7 @@
       <w:r>
         <w:rPr>
           <w:rFonts w:ascii="Courier New" w:hAnsi="Courier New" w:cs="Courier New"/>
+          <w:noProof/>
         </w:rPr>
         <w:drawing>
           <wp:inline distT="0" distB="0" distL="0" distR="0" wp14:anchorId="0E00DB58" wp14:editId="1C37705D">
@@ -886,6 +887,7 @@
       <w:r>
         <w:rPr>
           <w:rFonts w:ascii="Courier New" w:hAnsi="Courier New" w:cs="Courier New"/>
+          <w:noProof/>
         </w:rPr>
         <w:drawing>
           <wp:inline distT="0" distB="0" distL="0" distR="0" wp14:anchorId="1950A23E" wp14:editId="5D852C73">
@@ -1009,6 +1011,7 @@
       <w:r>
         <w:rPr>
           <w:rFonts w:ascii="Courier New" w:hAnsi="Courier New" w:cs="Courier New"/>
+          <w:noProof/>
         </w:rPr>
         <w:drawing>
           <wp:inline distT="0" distB="0" distL="0" distR="0" wp14:anchorId="3E4FC108" wp14:editId="4D8EF34C">
@@ -1085,6 +1088,7 @@
       <w:r>
         <w:rPr>
           <w:rFonts w:ascii="Courier New" w:hAnsi="Courier New" w:cs="Courier New"/>
+          <w:noProof/>
         </w:rPr>
         <w:drawing>
           <wp:inline distT="0" distB="0" distL="0" distR="0" wp14:anchorId="734F9B14" wp14:editId="463C8AEC">
@@ -1201,6 +1205,7 @@
       <w:r>
         <w:rPr>
           <w:rFonts w:ascii="Courier New" w:hAnsi="Courier New" w:cs="Courier New"/>
+          <w:noProof/>
         </w:rPr>
         <w:drawing>
           <wp:inline distT="0" distB="0" distL="0" distR="0" wp14:anchorId="0B435568" wp14:editId="3A985D40">
@@ -1277,6 +1282,7 @@
       <w:r>
         <w:rPr>
           <w:rFonts w:ascii="Courier New" w:hAnsi="Courier New" w:cs="Courier New"/>
+          <w:noProof/>
         </w:rPr>
         <w:drawing>
           <wp:inline distT="0" distB="0" distL="0" distR="0" wp14:anchorId="59325251" wp14:editId="6405A2D7">
@@ -1411,6 +1417,7 @@
       <w:r>
         <w:rPr>
           <w:rFonts w:ascii="Courier New" w:hAnsi="Courier New" w:cs="Courier New"/>
+          <w:noProof/>
         </w:rPr>
         <w:drawing>
           <wp:inline distT="0" distB="0" distL="0" distR="0" wp14:anchorId="32AFAEE9" wp14:editId="07829449">
@@ -1497,6 +1504,7 @@
       <w:r>
         <w:rPr>
           <w:rFonts w:ascii="Courier New" w:hAnsi="Courier New" w:cs="Courier New"/>
+          <w:noProof/>
         </w:rPr>
         <w:drawing>
           <wp:inline distT="0" distB="0" distL="0" distR="0" wp14:anchorId="1AA4BF4B" wp14:editId="36C6B752">
@@ -1599,6 +1607,7 @@
       <w:r>
         <w:rPr>
           <w:rFonts w:ascii="Courier New" w:hAnsi="Courier New" w:cs="Courier New"/>
+          <w:noProof/>
         </w:rPr>
         <w:drawing>
           <wp:inline distT="0" distB="0" distL="0" distR="0" wp14:anchorId="345FB793" wp14:editId="0A5BAD67">
@@ -1683,6 +1692,7 @@
       <w:r>
         <w:rPr>
           <w:rFonts w:ascii="Courier New" w:hAnsi="Courier New" w:cs="Courier New"/>
+          <w:noProof/>
         </w:rPr>
         <w:drawing>
           <wp:inline distT="0" distB="0" distL="0" distR="0" wp14:anchorId="349D568C" wp14:editId="2E84641F">

</xml_diff>

<commit_message>
actualizacion de la documentacion
</commit_message>
<xml_diff>
--- a/README.docx
+++ b/README.docx
@@ -73,14 +73,6 @@
           <w:rFonts w:ascii="Courier New" w:hAnsi="Courier New" w:cs="Courier New"/>
         </w:rPr>
       </w:pPr>
-    </w:p>
-    <w:p>
-      <w:pPr>
-        <w:pStyle w:val="Textosinformato"/>
-        <w:rPr>
-          <w:rFonts w:ascii="Courier New" w:hAnsi="Courier New" w:cs="Courier New"/>
-        </w:rPr>
-      </w:pPr>
       <w:r>
         <w:rPr>
           <w:rFonts w:ascii="Courier New" w:hAnsi="Courier New" w:cs="Courier New"/>
@@ -209,14 +201,6 @@
           <w:rFonts w:ascii="Courier New" w:hAnsi="Courier New" w:cs="Courier New"/>
         </w:rPr>
       </w:pPr>
-    </w:p>
-    <w:p>
-      <w:pPr>
-        <w:pStyle w:val="Textosinformato"/>
-        <w:rPr>
-          <w:rFonts w:ascii="Courier New" w:hAnsi="Courier New" w:cs="Courier New"/>
-        </w:rPr>
-      </w:pPr>
       <w:r>
         <w:rPr>
           <w:rFonts w:ascii="Courier New" w:hAnsi="Courier New" w:cs="Courier New"/>
@@ -439,6 +423,119 @@
           <w:rFonts w:ascii="Courier New" w:hAnsi="Courier New" w:cs="Courier New"/>
         </w:rPr>
       </w:pPr>
+      <w:r>
+        <w:rPr>
+          <w:rFonts w:ascii="Courier New" w:hAnsi="Courier New" w:cs="Courier New"/>
+        </w:rPr>
+        <w:t>Variables de entorno .</w:t>
+      </w:r>
+      <w:proofErr w:type="spellStart"/>
+      <w:r>
+        <w:rPr>
+          <w:rFonts w:ascii="Courier New" w:hAnsi="Courier New" w:cs="Courier New"/>
+        </w:rPr>
+        <w:t>env</w:t>
+      </w:r>
+      <w:proofErr w:type="spellEnd"/>
+    </w:p>
+    <w:p>
+      <w:pPr>
+        <w:pStyle w:val="Textosinformato"/>
+        <w:rPr>
+          <w:rFonts w:ascii="Courier New" w:hAnsi="Courier New" w:cs="Courier New"/>
+        </w:rPr>
+      </w:pPr>
+    </w:p>
+    <w:p>
+      <w:pPr>
+        <w:pStyle w:val="Textosinformato"/>
+      </w:pPr>
+      <w:r>
+        <w:t>PORT=3000</w:t>
+      </w:r>
+    </w:p>
+    <w:p>
+      <w:pPr>
+        <w:pStyle w:val="Textosinformato"/>
+      </w:pPr>
+      <w:r>
+        <w:t xml:space="preserve"> DB_NAME=</w:t>
+      </w:r>
+      <w:proofErr w:type="spellStart"/>
+      <w:r>
+        <w:t>software_votaciones</w:t>
+      </w:r>
+      <w:proofErr w:type="spellEnd"/>
+      <w:r>
+        <w:t xml:space="preserve"> </w:t>
+      </w:r>
+    </w:p>
+    <w:p>
+      <w:pPr>
+        <w:pStyle w:val="Textosinformato"/>
+      </w:pPr>
+      <w:r>
+        <w:t>DB_USER=</w:t>
+      </w:r>
+      <w:proofErr w:type="spellStart"/>
+      <w:r>
+        <w:t>postgres</w:t>
+      </w:r>
+      <w:proofErr w:type="spellEnd"/>
+      <w:r>
+        <w:t xml:space="preserve"> </w:t>
+      </w:r>
+    </w:p>
+    <w:p>
+      <w:pPr>
+        <w:pStyle w:val="Textosinformato"/>
+      </w:pPr>
+      <w:r>
+        <w:t xml:space="preserve">DB_PASSWORD=contraseña propia </w:t>
+      </w:r>
+    </w:p>
+    <w:p>
+      <w:pPr>
+        <w:pStyle w:val="Textosinformato"/>
+      </w:pPr>
+      <w:r>
+        <w:t xml:space="preserve">DB_HOST=localhost </w:t>
+      </w:r>
+    </w:p>
+    <w:p>
+      <w:pPr>
+        <w:pStyle w:val="Textosinformato"/>
+      </w:pPr>
+      <w:r>
+        <w:t>DB_DIALECT=</w:t>
+      </w:r>
+      <w:proofErr w:type="spellStart"/>
+      <w:r>
+        <w:t>postgres</w:t>
+      </w:r>
+      <w:proofErr w:type="spellEnd"/>
+      <w:r>
+        <w:t xml:space="preserve"> </w:t>
+      </w:r>
+    </w:p>
+    <w:p>
+      <w:pPr>
+        <w:pStyle w:val="Textosinformato"/>
+      </w:pPr>
+      <w:r>
+        <w:t>JWT_SECRET=</w:t>
+      </w:r>
+      <w:r>
+        <w:t xml:space="preserve"> </w:t>
+      </w:r>
+      <w:r>
+        <w:t>contraseña propia</w:t>
+      </w:r>
+    </w:p>
+    <w:p>
+      <w:pPr>
+        <w:pStyle w:val="Textosinformato"/>
+      </w:pPr>
     </w:p>
     <w:p>
       <w:pPr>
@@ -471,289 +568,241 @@
     <w:p>
       <w:pPr>
         <w:pStyle w:val="Textosinformato"/>
-        <w:rPr>
-          <w:rFonts w:ascii="Courier New" w:hAnsi="Courier New" w:cs="Courier New"/>
-        </w:rPr>
-      </w:pPr>
-    </w:p>
-    <w:p>
-      <w:pPr>
-        <w:pStyle w:val="Textosinformato"/>
-        <w:rPr>
-          <w:rFonts w:ascii="Courier New" w:hAnsi="Courier New" w:cs="Courier New"/>
-        </w:rPr>
-      </w:pPr>
-      <w:r>
-        <w:rPr>
-          <w:rFonts w:ascii="Courier New" w:hAnsi="Courier New" w:cs="Courier New"/>
-        </w:rPr>
-        <w:t>Variables de entorno .</w:t>
-      </w:r>
-      <w:proofErr w:type="spellStart"/>
-      <w:r>
-        <w:rPr>
-          <w:rFonts w:ascii="Courier New" w:hAnsi="Courier New" w:cs="Courier New"/>
-        </w:rPr>
-        <w:t>env</w:t>
-      </w:r>
-      <w:proofErr w:type="spellEnd"/>
-    </w:p>
-    <w:p>
-      <w:pPr>
-        <w:pStyle w:val="Textosinformato"/>
-        <w:rPr>
-          <w:rFonts w:ascii="Courier New" w:hAnsi="Courier New" w:cs="Courier New"/>
-        </w:rPr>
-      </w:pPr>
-    </w:p>
-    <w:p>
-      <w:pPr>
-        <w:pStyle w:val="Textosinformato"/>
-      </w:pPr>
-      <w:r>
-        <w:t>PORT=3000</w:t>
-      </w:r>
-    </w:p>
-    <w:p>
-      <w:pPr>
-        <w:pStyle w:val="Textosinformato"/>
-      </w:pPr>
-      <w:r>
-        <w:t xml:space="preserve"> DB_NAME=</w:t>
-      </w:r>
-      <w:proofErr w:type="spellStart"/>
-      <w:r>
-        <w:t>software_votaciones</w:t>
-      </w:r>
-      <w:proofErr w:type="spellEnd"/>
-      <w:r>
-        <w:t xml:space="preserve"> </w:t>
-      </w:r>
-    </w:p>
-    <w:p>
-      <w:pPr>
-        <w:pStyle w:val="Textosinformato"/>
-      </w:pPr>
-      <w:r>
-        <w:t>DB_USER=</w:t>
-      </w:r>
-      <w:proofErr w:type="spellStart"/>
-      <w:r>
-        <w:t>postgres</w:t>
-      </w:r>
-      <w:proofErr w:type="spellEnd"/>
-      <w:r>
-        <w:t xml:space="preserve"> </w:t>
-      </w:r>
-    </w:p>
-    <w:p>
-      <w:pPr>
-        <w:pStyle w:val="Textosinformato"/>
-      </w:pPr>
-      <w:r>
-        <w:t xml:space="preserve">DB_PASSWORD=contraseña propia </w:t>
-      </w:r>
-    </w:p>
-    <w:p>
-      <w:pPr>
-        <w:pStyle w:val="Textosinformato"/>
-      </w:pPr>
-      <w:r>
-        <w:t xml:space="preserve">DB_HOST=localhost </w:t>
-      </w:r>
-    </w:p>
-    <w:p>
-      <w:pPr>
-        <w:pStyle w:val="Textosinformato"/>
-      </w:pPr>
-      <w:r>
-        <w:t>DB_DIALECT=</w:t>
-      </w:r>
-      <w:proofErr w:type="spellStart"/>
-      <w:r>
-        <w:t>postgres</w:t>
-      </w:r>
-      <w:proofErr w:type="spellEnd"/>
-      <w:r>
-        <w:t xml:space="preserve"> </w:t>
-      </w:r>
-    </w:p>
-    <w:p>
-      <w:pPr>
-        <w:pStyle w:val="Textosinformato"/>
-      </w:pPr>
-      <w:r>
-        <w:t>JWT_SECRET=</w:t>
-      </w:r>
-      <w:r>
-        <w:t xml:space="preserve"> </w:t>
-      </w:r>
-      <w:r>
-        <w:t>contraseña propia</w:t>
-      </w:r>
-    </w:p>
-    <w:p>
-      <w:pPr>
-        <w:pStyle w:val="Textosinformato"/>
-      </w:pPr>
-    </w:p>
-    <w:p>
-      <w:pPr>
-        <w:pStyle w:val="Textosinformato"/>
-        <w:rPr>
-          <w:rFonts w:ascii="Courier New" w:hAnsi="Courier New" w:cs="Courier New"/>
+      </w:pPr>
+      <w:r>
+        <w:br/>
+      </w:r>
+      <w:r>
+        <w:t xml:space="preserve">Para ejecutar desde </w:t>
+      </w:r>
+      <w:proofErr w:type="spellStart"/>
+      <w:r>
+        <w:t>bash</w:t>
+      </w:r>
+      <w:proofErr w:type="spellEnd"/>
+      <w:r>
+        <w:t xml:space="preserve"> use: </w:t>
+      </w:r>
+      <w:proofErr w:type="spellStart"/>
+      <w:r>
+        <w:rPr>
           <w:b/>
           <w:bCs/>
         </w:rPr>
-      </w:pPr>
-      <w:r>
-        <w:t xml:space="preserve">Para ejecutar desde </w:t>
-      </w:r>
-      <w:proofErr w:type="spellStart"/>
-      <w:r>
-        <w:t>bash</w:t>
-      </w:r>
-      <w:proofErr w:type="spellEnd"/>
-      <w:r>
-        <w:t xml:space="preserve"> use: </w:t>
-      </w:r>
-      <w:proofErr w:type="spellStart"/>
+        <w:t>npm</w:t>
+      </w:r>
+      <w:proofErr w:type="spellEnd"/>
       <w:r>
         <w:rPr>
           <w:b/>
           <w:bCs/>
         </w:rPr>
-        <w:t>npm</w:t>
-      </w:r>
-      <w:proofErr w:type="spellEnd"/>
+        <w:t xml:space="preserve"> run </w:t>
+      </w:r>
+      <w:proofErr w:type="spellStart"/>
       <w:r>
         <w:rPr>
           <w:b/>
           <w:bCs/>
         </w:rPr>
-        <w:t xml:space="preserve"> run </w:t>
-      </w:r>
-      <w:proofErr w:type="spellStart"/>
+        <w:t>dev</w:t>
+      </w:r>
+      <w:proofErr w:type="spellEnd"/>
       <w:r>
         <w:rPr>
           <w:b/>
           <w:bCs/>
         </w:rPr>
-        <w:t>dev</w:t>
-      </w:r>
-      <w:proofErr w:type="spellEnd"/>
-    </w:p>
-    <w:p>
-      <w:pPr>
-        <w:pStyle w:val="Textosinformato"/>
-        <w:rPr>
-          <w:rFonts w:ascii="Courier New" w:hAnsi="Courier New" w:cs="Courier New"/>
-        </w:rPr>
-      </w:pPr>
-    </w:p>
-    <w:p>
-      <w:pPr>
-        <w:pStyle w:val="Textosinformato"/>
-        <w:rPr>
-          <w:rFonts w:ascii="Courier New" w:hAnsi="Courier New" w:cs="Courier New"/>
-        </w:rPr>
-      </w:pPr>
-    </w:p>
-    <w:p>
-      <w:pPr>
-        <w:pStyle w:val="Textosinformato"/>
-        <w:rPr>
-          <w:rFonts w:ascii="Courier New" w:hAnsi="Courier New" w:cs="Courier New"/>
-        </w:rPr>
-      </w:pPr>
-    </w:p>
-    <w:p>
-      <w:pPr>
-        <w:pStyle w:val="Textosinformato"/>
-        <w:rPr>
-          <w:rFonts w:ascii="Courier New" w:hAnsi="Courier New" w:cs="Courier New"/>
-        </w:rPr>
-      </w:pPr>
-    </w:p>
-    <w:p>
-      <w:pPr>
-        <w:pStyle w:val="Textosinformato"/>
-        <w:rPr>
-          <w:rFonts w:ascii="Courier New" w:hAnsi="Courier New" w:cs="Courier New"/>
-        </w:rPr>
-      </w:pPr>
-    </w:p>
-    <w:p>
-      <w:pPr>
-        <w:pStyle w:val="Textosinformato"/>
-        <w:rPr>
-          <w:rFonts w:ascii="Courier New" w:hAnsi="Courier New" w:cs="Courier New"/>
-        </w:rPr>
-      </w:pPr>
-    </w:p>
-    <w:p>
-      <w:pPr>
-        <w:pStyle w:val="Textosinformato"/>
-        <w:rPr>
-          <w:rFonts w:ascii="Courier New" w:hAnsi="Courier New" w:cs="Courier New"/>
-        </w:rPr>
-      </w:pPr>
-    </w:p>
-    <w:p>
-      <w:pPr>
-        <w:pStyle w:val="Textosinformato"/>
-        <w:rPr>
-          <w:rFonts w:ascii="Courier New" w:hAnsi="Courier New" w:cs="Courier New"/>
-        </w:rPr>
-      </w:pPr>
-    </w:p>
-    <w:p>
-      <w:pPr>
-        <w:pStyle w:val="Textosinformato"/>
-        <w:rPr>
-          <w:rFonts w:ascii="Courier New" w:hAnsi="Courier New" w:cs="Courier New"/>
-        </w:rPr>
-      </w:pPr>
-    </w:p>
-    <w:p>
-      <w:pPr>
-        <w:pStyle w:val="Textosinformato"/>
-        <w:rPr>
-          <w:rFonts w:ascii="Courier New" w:hAnsi="Courier New" w:cs="Courier New"/>
-        </w:rPr>
-      </w:pPr>
-    </w:p>
-    <w:p>
-      <w:pPr>
-        <w:pStyle w:val="Textosinformato"/>
-        <w:rPr>
-          <w:rFonts w:ascii="Courier New" w:hAnsi="Courier New" w:cs="Courier New"/>
-        </w:rPr>
-      </w:pPr>
-    </w:p>
-    <w:p>
-      <w:pPr>
-        <w:pStyle w:val="Textosinformato"/>
-        <w:rPr>
-          <w:rFonts w:ascii="Courier New" w:hAnsi="Courier New" w:cs="Courier New"/>
-        </w:rPr>
-      </w:pPr>
-    </w:p>
-    <w:p>
-      <w:pPr>
-        <w:pStyle w:val="Textosinformato"/>
-        <w:rPr>
-          <w:rFonts w:ascii="Courier New" w:hAnsi="Courier New" w:cs="Courier New"/>
-        </w:rPr>
-      </w:pPr>
-    </w:p>
-    <w:p>
-      <w:pPr>
-        <w:pStyle w:val="Textosinformato"/>
-        <w:rPr>
-          <w:rFonts w:ascii="Courier New" w:hAnsi="Courier New" w:cs="Courier New"/>
-        </w:rPr>
-      </w:pPr>
+        <w:t xml:space="preserve"> </w:t>
+      </w:r>
+      <w:r>
+        <w:t>desde la</w:t>
+      </w:r>
+      <w:r>
+        <w:t>s</w:t>
+      </w:r>
+      <w:r>
+        <w:t xml:space="preserve"> carpeta</w:t>
+      </w:r>
+      <w:r>
+        <w:t>s</w:t>
+      </w:r>
+      <w:r>
+        <w:t xml:space="preserve"> </w:t>
+      </w:r>
+      <w:proofErr w:type="spellStart"/>
+      <w:r>
+        <w:t>frontend</w:t>
+      </w:r>
+      <w:proofErr w:type="spellEnd"/>
+      <w:r>
+        <w:t xml:space="preserve"> y </w:t>
+      </w:r>
+      <w:proofErr w:type="spellStart"/>
+      <w:r>
+        <w:t>backend</w:t>
+      </w:r>
+      <w:proofErr w:type="spellEnd"/>
+      <w:r>
+        <w:t xml:space="preserve"> respectivamente.</w:t>
+      </w:r>
+    </w:p>
+    <w:p>
+      <w:pPr>
+        <w:pStyle w:val="Textosinformato"/>
+        <w:rPr>
+          <w:b/>
+          <w:bCs/>
+        </w:rPr>
+      </w:pPr>
+    </w:p>
+    <w:p>
+      <w:pPr>
+        <w:pStyle w:val="Textosinformato"/>
+      </w:pPr>
+      <w:r>
+        <w:t xml:space="preserve">Se realizó el </w:t>
+      </w:r>
+      <w:proofErr w:type="spellStart"/>
+      <w:r>
+        <w:t>frontend</w:t>
+      </w:r>
+      <w:proofErr w:type="spellEnd"/>
+      <w:r>
+        <w:t xml:space="preserve"> (fuera del tiempo de la entrega) usando </w:t>
+      </w:r>
+      <w:proofErr w:type="spellStart"/>
+      <w:r>
+        <w:t>react</w:t>
+      </w:r>
+      <w:proofErr w:type="spellEnd"/>
+      <w:r>
+        <w:t xml:space="preserve">(vite, </w:t>
+      </w:r>
+      <w:proofErr w:type="spellStart"/>
+      <w:proofErr w:type="gramStart"/>
+      <w:r>
+        <w:t>axios</w:t>
+      </w:r>
+      <w:proofErr w:type="spellEnd"/>
+      <w:r>
+        <w:t xml:space="preserve">  y</w:t>
+      </w:r>
+      <w:proofErr w:type="gramEnd"/>
+      <w:r>
+        <w:t xml:space="preserve"> </w:t>
+      </w:r>
+      <w:proofErr w:type="spellStart"/>
+      <w:r>
+        <w:t>react</w:t>
+      </w:r>
+      <w:proofErr w:type="spellEnd"/>
+      <w:r>
+        <w:t xml:space="preserve"> </w:t>
+      </w:r>
+      <w:proofErr w:type="spellStart"/>
+      <w:r>
+        <w:t>router</w:t>
+      </w:r>
+      <w:proofErr w:type="spellEnd"/>
+      <w:r>
+        <w:t xml:space="preserve"> dom</w:t>
+      </w:r>
+      <w:r>
+        <w:t>.</w:t>
+      </w:r>
+      <w:r>
+        <w:br/>
+        <w:t>registro de votantes.</w:t>
+      </w:r>
+    </w:p>
+    <w:p>
+      <w:pPr>
+        <w:pStyle w:val="Textosinformato"/>
+      </w:pPr>
+      <w:r>
+        <w:t>Ingreso con contraseña.</w:t>
+      </w:r>
+    </w:p>
+    <w:p>
+      <w:pPr>
+        <w:pStyle w:val="Textosinformato"/>
+      </w:pPr>
+      <w:r>
+        <w:t>Emisión del voto desde un dashboard</w:t>
+      </w:r>
+    </w:p>
+    <w:p>
+      <w:pPr>
+        <w:pStyle w:val="Textosinformato"/>
+      </w:pPr>
+    </w:p>
+    <w:p>
+      <w:pPr>
+        <w:pStyle w:val="Textosinformato"/>
+      </w:pPr>
+      <w:r>
+        <w:t>Ruta para crear candidatos</w:t>
+      </w:r>
+      <w:r>
+        <w:br/>
+      </w:r>
+      <w:r>
+        <w:t>http://localhost:5173/admin/candidates</w:t>
+      </w:r>
+    </w:p>
+    <w:p>
+      <w:pPr>
+        <w:pStyle w:val="Textosinformato"/>
+        <w:rPr>
+          <w:rFonts w:ascii="Courier New" w:hAnsi="Courier New" w:cs="Courier New"/>
+        </w:rPr>
+      </w:pPr>
+    </w:p>
+    <w:p>
+      <w:pPr>
+        <w:pStyle w:val="Textosinformato"/>
+        <w:rPr>
+          <w:rFonts w:ascii="Courier New" w:hAnsi="Courier New" w:cs="Courier New"/>
+        </w:rPr>
+      </w:pPr>
+    </w:p>
+    <w:p>
+      <w:pPr>
+        <w:pStyle w:val="Textosinformato"/>
+        <w:jc w:val="right"/>
+        <w:rPr>
+          <w:rFonts w:ascii="Courier New" w:hAnsi="Courier New" w:cs="Courier New"/>
+        </w:rPr>
+      </w:pPr>
+      <w:r>
+        <w:rPr>
+          <w:rFonts w:ascii="Courier New" w:hAnsi="Courier New" w:cs="Courier New"/>
+        </w:rPr>
+        <w:t>Juan Fernando Uribe Medina</w:t>
+      </w:r>
+      <w:r>
+        <w:rPr>
+          <w:rFonts w:ascii="Courier New" w:hAnsi="Courier New" w:cs="Courier New"/>
+        </w:rPr>
+        <w:br/>
+        <w:t>Tecnólogo en análisis y desarrollo de software</w:t>
+      </w:r>
+    </w:p>
+    <w:p>
+      <w:pPr>
+        <w:pStyle w:val="Textosinformato"/>
+        <w:jc w:val="right"/>
+        <w:rPr>
+          <w:rFonts w:ascii="Courier New" w:hAnsi="Courier New" w:cs="Courier New"/>
+        </w:rPr>
+      </w:pPr>
+      <w:r>
+        <w:rPr>
+          <w:rFonts w:ascii="Courier New" w:hAnsi="Courier New" w:cs="Courier New"/>
+        </w:rPr>
+        <w:t>Estudiante Ingeniería de Software</w:t>
+      </w:r>
     </w:p>
     <w:p>
       <w:pPr>

</xml_diff>